<commit_message>
Day 1 documentation and Basket functionality
</commit_message>
<xml_diff>
--- a/Task2_DevelopmentDocumentation_LL-000020927_Chukwudolue_T.docx
+++ b/Task2_DevelopmentDocumentation_LL-000020927_Chukwudolue_T.docx
@@ -5,7 +5,9 @@
     <w:sdt>
       <w:sdtPr>
         <w:rPr>
+          <w:rFonts w:eastAsiaTheme="minorHAnsi"/>
           <w:sz w:val="2"/>
+          <w:lang w:eastAsia="en-US"/>
         </w:rPr>
         <w:id w:val="-386260136"/>
         <w:docPartObj>
@@ -15,9 +17,7 @@
       </w:sdtPr>
       <w:sdtEndPr>
         <w:rPr>
-          <w:rFonts w:eastAsiaTheme="minorHAnsi"/>
           <w:sz w:val="22"/>
-          <w:lang w:eastAsia="en-US"/>
         </w:rPr>
       </w:sdtEndPr>
       <w:sdtContent>
@@ -153,6 +153,7 @@
                                     <w:dataBinding w:prefixMappings="xmlns:ns0='http://purl.org/dc/elements/1.1/' xmlns:ns1='http://schemas.openxmlformats.org/package/2006/metadata/core-properties' " w:xpath="/ns1:coreProperties[1]/ns0:subject[1]" w:storeItemID="{6C3C8BC8-F283-45AE-878A-BAB7291924A1}"/>
                                     <w:text/>
                                   </w:sdtPr>
+                                  <w:sdtEndPr/>
                                   <w:sdtContent>
                                     <w:r>
                                       <w:rPr>
@@ -264,6 +265,7 @@
                               <w:dataBinding w:prefixMappings="xmlns:ns0='http://purl.org/dc/elements/1.1/' xmlns:ns1='http://schemas.openxmlformats.org/package/2006/metadata/core-properties' " w:xpath="/ns1:coreProperties[1]/ns0:subject[1]" w:storeItemID="{6C3C8BC8-F283-45AE-878A-BAB7291924A1}"/>
                               <w:text/>
                             </w:sdtPr>
+                            <w:sdtEndPr/>
                             <w:sdtContent>
                               <w:r>
                                 <w:rPr>
@@ -900,6 +902,7 @@
                                     <w:dataBinding w:prefixMappings="xmlns:ns0='http://schemas.openxmlformats.org/officeDocument/2006/extended-properties' " w:xpath="/ns0:Properties[1]/ns0:Company[1]" w:storeItemID="{6668398D-A668-4E3E-A5EB-62B293D839F1}"/>
                                     <w:text/>
                                   </w:sdtPr>
+                                  <w:sdtEndPr/>
                                   <w:sdtContent>
                                     <w:r>
                                       <w:rPr>
@@ -926,6 +929,7 @@
                                   <w:dataBinding w:prefixMappings="xmlns:ns0='http://purl.org/dc/elements/1.1/' xmlns:ns1='http://schemas.openxmlformats.org/package/2006/metadata/core-properties' " w:xpath="/ns1:coreProperties[1]/ns1:category[1]" w:storeItemID="{6C3C8BC8-F283-45AE-878A-BAB7291924A1}"/>
                                   <w:text/>
                                 </w:sdtPr>
+                                <w:sdtEndPr/>
                                 <w:sdtContent>
                                   <w:p>
                                     <w:pPr>
@@ -996,6 +1000,7 @@
                               <w:dataBinding w:prefixMappings="xmlns:ns0='http://schemas.openxmlformats.org/officeDocument/2006/extended-properties' " w:xpath="/ns0:Properties[1]/ns0:Company[1]" w:storeItemID="{6668398D-A668-4E3E-A5EB-62B293D839F1}"/>
                               <w:text/>
                             </w:sdtPr>
+                            <w:sdtEndPr/>
                             <w:sdtContent>
                               <w:r>
                                 <w:rPr>
@@ -1022,6 +1027,7 @@
                             <w:dataBinding w:prefixMappings="xmlns:ns0='http://purl.org/dc/elements/1.1/' xmlns:ns1='http://schemas.openxmlformats.org/package/2006/metadata/core-properties' " w:xpath="/ns1:coreProperties[1]/ns1:category[1]" w:storeItemID="{6C3C8BC8-F283-45AE-878A-BAB7291924A1}"/>
                             <w:text/>
                           </w:sdtPr>
+                          <w:sdtEndPr/>
                           <w:sdtContent>
                             <w:p>
                               <w:pPr>
@@ -1062,6 +1068,13 @@
     </w:sdt>
     <w:sdt>
       <w:sdtPr>
+        <w:rPr>
+          <w:rFonts w:asciiTheme="minorHAnsi" w:eastAsiaTheme="minorHAnsi" w:hAnsiTheme="minorHAnsi" w:cstheme="minorBidi"/>
+          <w:color w:val="auto"/>
+          <w:sz w:val="22"/>
+          <w:szCs w:val="22"/>
+          <w:lang w:eastAsia="en-US"/>
+        </w:rPr>
         <w:id w:val="1368564557"/>
         <w:docPartObj>
           <w:docPartGallery w:val="Table of Contents"/>
@@ -1070,13 +1083,8 @@
       </w:sdtPr>
       <w:sdtEndPr>
         <w:rPr>
-          <w:rFonts w:asciiTheme="minorHAnsi" w:eastAsiaTheme="minorHAnsi" w:hAnsiTheme="minorHAnsi" w:cstheme="minorBidi"/>
-          <w:b/>
-          <w:bCs/>
-          <w:color w:val="auto"/>
-          <w:sz w:val="22"/>
-          <w:szCs w:val="22"/>
-          <w:lang w:eastAsia="en-US"/>
+          <w:b/>
+          <w:bCs/>
         </w:rPr>
       </w:sdtEndPr>
       <w:sdtContent>
@@ -1109,10 +1117,12 @@
           <w:r>
             <w:fldChar w:fldCharType="separate"/>
           </w:r>
-          <w:hyperlink w:anchor="_Toc226974628" w:history="1">
+          <w:hyperlink w:anchor="_Toc226988544" w:history="1">
             <w:r>
               <w:rPr>
                 <w:rStyle w:val="Hyperlink"/>
+                <w:b/>
+                <w:bCs/>
                 <w:noProof/>
               </w:rPr>
               <w:t>Version 1.0.0</w:t>
@@ -1136,7 +1146,7 @@
                 <w:noProof/>
                 <w:webHidden/>
               </w:rPr>
-              <w:instrText xml:space="preserve"> PAGEREF _Toc226974628 \h </w:instrText>
+              <w:instrText xml:space="preserve"> PAGEREF _Toc226988544 \h </w:instrText>
             </w:r>
             <w:r>
               <w:rPr>
@@ -1169,6 +1179,222 @@
         </w:p>
         <w:p>
           <w:pPr>
+            <w:pStyle w:val="TOC2"/>
+            <w:tabs>
+              <w:tab w:val="right" w:leader="dot" w:pos="9016"/>
+            </w:tabs>
+            <w:rPr>
+              <w:rFonts w:eastAsiaTheme="minorEastAsia"/>
+              <w:noProof/>
+              <w:lang w:eastAsia="en-GB"/>
+            </w:rPr>
+          </w:pPr>
+          <w:hyperlink w:anchor="_Toc226988545" w:history="1">
+            <w:r>
+              <w:rPr>
+                <w:rStyle w:val="Hyperlink"/>
+                <w:b/>
+                <w:bCs/>
+                <w:noProof/>
+              </w:rPr>
+              <w:t>Day 1</w:t>
+            </w:r>
+            <w:r>
+              <w:rPr>
+                <w:noProof/>
+                <w:webHidden/>
+              </w:rPr>
+              <w:tab/>
+            </w:r>
+            <w:r>
+              <w:rPr>
+                <w:noProof/>
+                <w:webHidden/>
+              </w:rPr>
+              <w:fldChar w:fldCharType="begin"/>
+            </w:r>
+            <w:r>
+              <w:rPr>
+                <w:noProof/>
+                <w:webHidden/>
+              </w:rPr>
+              <w:instrText xml:space="preserve"> PAGEREF _Toc226988545 \h </w:instrText>
+            </w:r>
+            <w:r>
+              <w:rPr>
+                <w:noProof/>
+                <w:webHidden/>
+              </w:rPr>
+            </w:r>
+            <w:r>
+              <w:rPr>
+                <w:noProof/>
+                <w:webHidden/>
+              </w:rPr>
+              <w:fldChar w:fldCharType="separate"/>
+            </w:r>
+            <w:r>
+              <w:rPr>
+                <w:noProof/>
+                <w:webHidden/>
+              </w:rPr>
+              <w:t>2</w:t>
+            </w:r>
+            <w:r>
+              <w:rPr>
+                <w:noProof/>
+                <w:webHidden/>
+              </w:rPr>
+              <w:fldChar w:fldCharType="end"/>
+            </w:r>
+          </w:hyperlink>
+        </w:p>
+        <w:p>
+          <w:pPr>
+            <w:pStyle w:val="TOC3"/>
+            <w:tabs>
+              <w:tab w:val="right" w:leader="dot" w:pos="9016"/>
+            </w:tabs>
+            <w:rPr>
+              <w:rFonts w:eastAsiaTheme="minorEastAsia"/>
+              <w:noProof/>
+              <w:lang w:eastAsia="en-GB"/>
+            </w:rPr>
+          </w:pPr>
+          <w:hyperlink w:anchor="_Toc226988546" w:history="1">
+            <w:r>
+              <w:rPr>
+                <w:rStyle w:val="Hyperlink"/>
+                <w:b/>
+                <w:bCs/>
+                <w:noProof/>
+              </w:rPr>
+              <w:t>Creating and setting up the project</w:t>
+            </w:r>
+            <w:r>
+              <w:rPr>
+                <w:noProof/>
+                <w:webHidden/>
+              </w:rPr>
+              <w:tab/>
+            </w:r>
+            <w:r>
+              <w:rPr>
+                <w:noProof/>
+                <w:webHidden/>
+              </w:rPr>
+              <w:fldChar w:fldCharType="begin"/>
+            </w:r>
+            <w:r>
+              <w:rPr>
+                <w:noProof/>
+                <w:webHidden/>
+              </w:rPr>
+              <w:instrText xml:space="preserve"> PAGEREF _Toc226988546 \h </w:instrText>
+            </w:r>
+            <w:r>
+              <w:rPr>
+                <w:noProof/>
+                <w:webHidden/>
+              </w:rPr>
+            </w:r>
+            <w:r>
+              <w:rPr>
+                <w:noProof/>
+                <w:webHidden/>
+              </w:rPr>
+              <w:fldChar w:fldCharType="separate"/>
+            </w:r>
+            <w:r>
+              <w:rPr>
+                <w:noProof/>
+                <w:webHidden/>
+              </w:rPr>
+              <w:t>2</w:t>
+            </w:r>
+            <w:r>
+              <w:rPr>
+                <w:noProof/>
+                <w:webHidden/>
+              </w:rPr>
+              <w:fldChar w:fldCharType="end"/>
+            </w:r>
+          </w:hyperlink>
+        </w:p>
+        <w:p>
+          <w:pPr>
+            <w:pStyle w:val="TOC3"/>
+            <w:tabs>
+              <w:tab w:val="right" w:leader="dot" w:pos="9016"/>
+            </w:tabs>
+            <w:rPr>
+              <w:rFonts w:eastAsiaTheme="minorEastAsia"/>
+              <w:noProof/>
+              <w:lang w:eastAsia="en-GB"/>
+            </w:rPr>
+          </w:pPr>
+          <w:hyperlink w:anchor="_Toc226988547" w:history="1">
+            <w:r>
+              <w:rPr>
+                <w:rStyle w:val="Hyperlink"/>
+                <w:b/>
+                <w:bCs/>
+                <w:noProof/>
+              </w:rPr>
+              <w:t>Models</w:t>
+            </w:r>
+            <w:r>
+              <w:rPr>
+                <w:noProof/>
+                <w:webHidden/>
+              </w:rPr>
+              <w:tab/>
+            </w:r>
+            <w:r>
+              <w:rPr>
+                <w:noProof/>
+                <w:webHidden/>
+              </w:rPr>
+              <w:fldChar w:fldCharType="begin"/>
+            </w:r>
+            <w:r>
+              <w:rPr>
+                <w:noProof/>
+                <w:webHidden/>
+              </w:rPr>
+              <w:instrText xml:space="preserve"> PAGEREF _Toc226988547 \h </w:instrText>
+            </w:r>
+            <w:r>
+              <w:rPr>
+                <w:noProof/>
+                <w:webHidden/>
+              </w:rPr>
+            </w:r>
+            <w:r>
+              <w:rPr>
+                <w:noProof/>
+                <w:webHidden/>
+              </w:rPr>
+              <w:fldChar w:fldCharType="separate"/>
+            </w:r>
+            <w:r>
+              <w:rPr>
+                <w:noProof/>
+                <w:webHidden/>
+              </w:rPr>
+              <w:t>3</w:t>
+            </w:r>
+            <w:r>
+              <w:rPr>
+                <w:noProof/>
+                <w:webHidden/>
+              </w:rPr>
+              <w:fldChar w:fldCharType="end"/>
+            </w:r>
+          </w:hyperlink>
+        </w:p>
+        <w:p>
+          <w:pPr>
             <w:rPr>
               <w:b/>
               <w:bCs/>
@@ -1411,21 +1637,1268 @@
     <w:p>
       <w:pPr>
         <w:pStyle w:val="Heading1"/>
-      </w:pPr>
-      <w:bookmarkStart w:id="0" w:name="_Toc226974628"/>
-      <w:r>
+        <w:rPr>
+          <w:b/>
+          <w:bCs/>
+          <w:sz w:val="28"/>
+          <w:szCs w:val="28"/>
+        </w:rPr>
+      </w:pPr>
+      <w:bookmarkStart w:id="0" w:name="_Toc226988544"/>
+      <w:r>
+        <w:rPr>
+          <w:b/>
+          <w:bCs/>
+          <w:sz w:val="28"/>
+          <w:szCs w:val="28"/>
+        </w:rPr>
+        <w:t>Version 1.0.0</w:t>
+      </w:r>
+      <w:bookmarkEnd w:id="0"/>
+    </w:p>
+    <w:p>
+      <w:pPr>
+        <w:pStyle w:val="Heading2"/>
+        <w:rPr>
+          <w:b/>
+          <w:bCs/>
+        </w:rPr>
+      </w:pPr>
+      <w:bookmarkStart w:id="1" w:name="_Toc226988545"/>
+      <w:r>
+        <w:rPr>
+          <w:b/>
+          <w:bCs/>
+        </w:rPr>
+        <w:t>Day 1</w:t>
+      </w:r>
+      <w:bookmarkEnd w:id="1"/>
+    </w:p>
+    <w:p>
+      <w:pPr>
+        <w:pStyle w:val="Heading3"/>
+        <w:rPr>
+          <w:b/>
+          <w:bCs/>
+        </w:rPr>
+      </w:pPr>
+      <w:bookmarkStart w:id="2" w:name="_Toc226988546"/>
+      <w:r>
+        <w:rPr>
+          <w:b/>
+          <w:bCs/>
+        </w:rPr>
+        <w:t>Creating and setting up the project</w:t>
+      </w:r>
+      <w:bookmarkEnd w:id="2"/>
+    </w:p>
+    <w:p/>
+    <w:p>
+      <w:pPr>
+        <w:rPr>
+          <w:sz w:val="24"/>
+          <w:szCs w:val="24"/>
+        </w:rPr>
+      </w:pPr>
+      <w:r>
+        <w:rPr>
+          <w:sz w:val="24"/>
+          <w:szCs w:val="24"/>
+        </w:rPr>
+        <w:t>The project was created using ASP.NET Core-Web App</w:t>
+      </w:r>
+    </w:p>
+    <w:p>
+      <w:pPr>
+        <w:rPr>
+          <w:sz w:val="24"/>
+          <w:szCs w:val="24"/>
+        </w:rPr>
+      </w:pPr>
+      <w:r>
+        <w:rPr>
+          <w:noProof/>
+          <w:sz w:val="24"/>
+          <w:szCs w:val="24"/>
+        </w:rPr>
+        <w:drawing>
+          <wp:inline distT="0" distB="0" distL="0" distR="0" wp14:anchorId="422200B8" wp14:editId="30DD9E2F">
+            <wp:extent cx="5731510" cy="581025"/>
+            <wp:effectExtent l="0" t="0" r="2540" b="9525"/>
+            <wp:docPr id="6" name="Picture 6"/>
+            <wp:cNvGraphicFramePr>
+              <a:graphicFrameLocks xmlns:a="http://schemas.openxmlformats.org/drawingml/2006/main" noChangeAspect="1"/>
+            </wp:cNvGraphicFramePr>
+            <a:graphic xmlns:a="http://schemas.openxmlformats.org/drawingml/2006/main">
+              <a:graphicData uri="http://schemas.openxmlformats.org/drawingml/2006/picture">
+                <pic:pic xmlns:pic="http://schemas.openxmlformats.org/drawingml/2006/picture">
+                  <pic:nvPicPr>
+                    <pic:cNvPr id="0" name="Picture 1"/>
+                    <pic:cNvPicPr>
+                      <a:picLocks noChangeAspect="1" noChangeArrowheads="1"/>
+                    </pic:cNvPicPr>
+                  </pic:nvPicPr>
+                  <pic:blipFill>
+                    <a:blip r:embed="rId5">
+                      <a:extLst>
+                        <a:ext uri="{28A0092B-C50C-407E-A947-70E740481C1C}">
+                          <a14:useLocalDpi xmlns:a14="http://schemas.microsoft.com/office/drawing/2010/main" val="0"/>
+                        </a:ext>
+                      </a:extLst>
+                    </a:blip>
+                    <a:srcRect/>
+                    <a:stretch>
+                      <a:fillRect/>
+                    </a:stretch>
+                  </pic:blipFill>
+                  <pic:spPr bwMode="auto">
+                    <a:xfrm>
+                      <a:off x="0" y="0"/>
+                      <a:ext cx="5731510" cy="581025"/>
+                    </a:xfrm>
+                    <a:prstGeom prst="rect">
+                      <a:avLst/>
+                    </a:prstGeom>
+                    <a:noFill/>
+                    <a:ln>
+                      <a:noFill/>
+                    </a:ln>
+                  </pic:spPr>
+                </pic:pic>
+              </a:graphicData>
+            </a:graphic>
+          </wp:inline>
+        </w:drawing>
+      </w:r>
+    </w:p>
+    <w:p>
+      <w:pPr>
+        <w:rPr>
+          <w:sz w:val="24"/>
+          <w:szCs w:val="24"/>
+        </w:rPr>
+      </w:pPr>
+      <w:r>
+        <w:rPr>
+          <w:sz w:val="24"/>
+          <w:szCs w:val="24"/>
+        </w:rPr>
+        <w:t>This template allows us to take use of Models, Views and Controllers which are utilised when creating both the front end and back end of a web application.</w:t>
+      </w:r>
+    </w:p>
+    <w:p>
+      <w:pPr>
+        <w:rPr>
+          <w:sz w:val="24"/>
+          <w:szCs w:val="24"/>
+        </w:rPr>
+      </w:pPr>
+      <w:r>
+        <w:rPr>
+          <w:sz w:val="24"/>
+          <w:szCs w:val="24"/>
+        </w:rPr>
+        <w:t>We name the project</w:t>
+      </w:r>
+      <w:r>
+        <w:rPr>
+          <w:sz w:val="24"/>
+          <w:szCs w:val="24"/>
+        </w:rPr>
+        <w:t xml:space="preserve"> E-commerce which would be a place holder for the folder name</w:t>
+      </w:r>
+      <w:r>
+        <w:rPr>
+          <w:sz w:val="24"/>
+          <w:szCs w:val="24"/>
+        </w:rPr>
+        <w:t>. We selected the .NET 9.0 Framework since it allows for better performance, new features, scalability and better optimisation.</w:t>
+      </w:r>
+    </w:p>
+    <w:p>
+      <w:pPr>
+        <w:rPr>
+          <w:sz w:val="24"/>
+          <w:szCs w:val="24"/>
+        </w:rPr>
+      </w:pPr>
+      <w:r>
+        <w:rPr>
+          <w:noProof/>
+          <w:sz w:val="24"/>
+          <w:szCs w:val="24"/>
+        </w:rPr>
+        <w:drawing>
+          <wp:inline distT="0" distB="0" distL="0" distR="0" wp14:anchorId="002000C9" wp14:editId="67E7F439">
+            <wp:extent cx="5457825" cy="962025"/>
+            <wp:effectExtent l="0" t="0" r="9525" b="9525"/>
+            <wp:docPr id="4" name="Picture 4"/>
+            <wp:cNvGraphicFramePr>
+              <a:graphicFrameLocks xmlns:a="http://schemas.openxmlformats.org/drawingml/2006/main" noChangeAspect="1"/>
+            </wp:cNvGraphicFramePr>
+            <a:graphic xmlns:a="http://schemas.openxmlformats.org/drawingml/2006/main">
+              <a:graphicData uri="http://schemas.openxmlformats.org/drawingml/2006/picture">
+                <pic:pic xmlns:pic="http://schemas.openxmlformats.org/drawingml/2006/picture">
+                  <pic:nvPicPr>
+                    <pic:cNvPr id="0" name="Picture 3"/>
+                    <pic:cNvPicPr>
+                      <a:picLocks noChangeAspect="1" noChangeArrowheads="1"/>
+                    </pic:cNvPicPr>
+                  </pic:nvPicPr>
+                  <pic:blipFill>
+                    <a:blip r:embed="rId6">
+                      <a:extLst>
+                        <a:ext uri="{28A0092B-C50C-407E-A947-70E740481C1C}">
+                          <a14:useLocalDpi xmlns:a14="http://schemas.microsoft.com/office/drawing/2010/main" val="0"/>
+                        </a:ext>
+                      </a:extLst>
+                    </a:blip>
+                    <a:srcRect/>
+                    <a:stretch>
+                      <a:fillRect/>
+                    </a:stretch>
+                  </pic:blipFill>
+                  <pic:spPr bwMode="auto">
+                    <a:xfrm>
+                      <a:off x="0" y="0"/>
+                      <a:ext cx="5457825" cy="962025"/>
+                    </a:xfrm>
+                    <a:prstGeom prst="rect">
+                      <a:avLst/>
+                    </a:prstGeom>
+                    <a:noFill/>
+                    <a:ln>
+                      <a:noFill/>
+                    </a:ln>
+                  </pic:spPr>
+                </pic:pic>
+              </a:graphicData>
+            </a:graphic>
+          </wp:inline>
+        </w:drawing>
+      </w:r>
+    </w:p>
+    <w:p>
+      <w:pPr>
+        <w:rPr>
+          <w:sz w:val="24"/>
+          <w:szCs w:val="24"/>
+        </w:rPr>
+      </w:pPr>
+      <w:r>
+        <w:rPr>
+          <w:sz w:val="24"/>
+          <w:szCs w:val="24"/>
+        </w:rPr>
+        <w:t>We select Individual accounts as this creates a Register and Log-In template which we can utilise for our web application. It creates the user database for us and all the functionality, being able to edit it and customise it to our needs.</w:t>
+      </w:r>
+    </w:p>
+    <w:p>
+      <w:pPr>
+        <w:rPr>
+          <w:sz w:val="24"/>
+          <w:szCs w:val="24"/>
+        </w:rPr>
+      </w:pPr>
+      <w:r>
+        <w:rPr>
+          <w:noProof/>
+          <w:sz w:val="24"/>
+          <w:szCs w:val="24"/>
+        </w:rPr>
+        <w:drawing>
+          <wp:inline distT="0" distB="0" distL="0" distR="0" wp14:anchorId="66CAC3CF" wp14:editId="425F7601">
+            <wp:extent cx="5572125" cy="1285875"/>
+            <wp:effectExtent l="0" t="0" r="9525" b="9525"/>
+            <wp:docPr id="3" name="Picture 3"/>
+            <wp:cNvGraphicFramePr>
+              <a:graphicFrameLocks xmlns:a="http://schemas.openxmlformats.org/drawingml/2006/main" noChangeAspect="1"/>
+            </wp:cNvGraphicFramePr>
+            <a:graphic xmlns:a="http://schemas.openxmlformats.org/drawingml/2006/main">
+              <a:graphicData uri="http://schemas.openxmlformats.org/drawingml/2006/picture">
+                <pic:pic xmlns:pic="http://schemas.openxmlformats.org/drawingml/2006/picture">
+                  <pic:nvPicPr>
+                    <pic:cNvPr id="0" name="Picture 4"/>
+                    <pic:cNvPicPr>
+                      <a:picLocks noChangeAspect="1" noChangeArrowheads="1"/>
+                    </pic:cNvPicPr>
+                  </pic:nvPicPr>
+                  <pic:blipFill>
+                    <a:blip r:embed="rId7">
+                      <a:extLst>
+                        <a:ext uri="{28A0092B-C50C-407E-A947-70E740481C1C}">
+                          <a14:useLocalDpi xmlns:a14="http://schemas.microsoft.com/office/drawing/2010/main" val="0"/>
+                        </a:ext>
+                      </a:extLst>
+                    </a:blip>
+                    <a:srcRect/>
+                    <a:stretch>
+                      <a:fillRect/>
+                    </a:stretch>
+                  </pic:blipFill>
+                  <pic:spPr bwMode="auto">
+                    <a:xfrm>
+                      <a:off x="0" y="0"/>
+                      <a:ext cx="5572125" cy="1285875"/>
+                    </a:xfrm>
+                    <a:prstGeom prst="rect">
+                      <a:avLst/>
+                    </a:prstGeom>
+                    <a:noFill/>
+                    <a:ln>
+                      <a:noFill/>
+                    </a:ln>
+                  </pic:spPr>
+                </pic:pic>
+              </a:graphicData>
+            </a:graphic>
+          </wp:inline>
+        </w:drawing>
+      </w:r>
+    </w:p>
+    <w:p>
+      <w:pPr>
+        <w:rPr>
+          <w:sz w:val="24"/>
+          <w:szCs w:val="24"/>
+        </w:rPr>
+      </w:pPr>
+    </w:p>
+    <w:p>
+      <w:pPr>
+        <w:rPr>
+          <w:sz w:val="24"/>
+          <w:szCs w:val="24"/>
+        </w:rPr>
+      </w:pPr>
+      <w:r>
+        <w:rPr>
+          <w:sz w:val="24"/>
+          <w:szCs w:val="24"/>
+        </w:rPr>
+        <w:t>We then tap on create. This builds the template for us to work on. Everything appears as expected but three additional packages were installed which allowed for some extra functionality. They were;</w:t>
+      </w:r>
+    </w:p>
+    <w:p>
+      <w:pPr>
+        <w:pStyle w:val="ListParagraph"/>
+        <w:numPr>
+          <w:ilvl w:val="0"/>
+          <w:numId w:val="1"/>
+        </w:numPr>
+        <w:rPr>
+          <w:sz w:val="24"/>
+          <w:szCs w:val="24"/>
+        </w:rPr>
+      </w:pPr>
+      <w:r>
+        <w:rPr>
+          <w:sz w:val="24"/>
+          <w:szCs w:val="24"/>
+        </w:rPr>
+        <w:t>Microsoft.VisualStudio. Web.CodeGeneration. Design</w:t>
+      </w:r>
+    </w:p>
+    <w:p>
+      <w:pPr>
+        <w:pStyle w:val="ListParagraph"/>
+        <w:numPr>
+          <w:ilvl w:val="0"/>
+          <w:numId w:val="1"/>
+        </w:numPr>
+        <w:rPr>
+          <w:sz w:val="24"/>
+          <w:szCs w:val="24"/>
+        </w:rPr>
+      </w:pPr>
+      <w:r>
+        <w:rPr>
+          <w:sz w:val="24"/>
+          <w:szCs w:val="24"/>
+        </w:rPr>
+        <w:t>Microsoft.EntityFrameworkCore. Design</w:t>
+      </w:r>
+    </w:p>
+    <w:p>
+      <w:pPr>
+        <w:pStyle w:val="ListParagraph"/>
+        <w:numPr>
+          <w:ilvl w:val="0"/>
+          <w:numId w:val="1"/>
+        </w:numPr>
+        <w:rPr>
+          <w:sz w:val="24"/>
+          <w:szCs w:val="24"/>
+        </w:rPr>
+      </w:pPr>
+      <w:r>
+        <w:rPr>
+          <w:sz w:val="24"/>
+          <w:szCs w:val="24"/>
+        </w:rPr>
+        <w:t>Microsoft. Entity. FrameworkCore.SqlServer</w:t>
+      </w:r>
+    </w:p>
+    <w:p>
+      <w:pPr>
+        <w:rPr>
+          <w:sz w:val="24"/>
+          <w:szCs w:val="24"/>
+        </w:rPr>
+      </w:pPr>
+      <w:r>
+        <w:rPr>
+          <w:sz w:val="24"/>
+          <w:szCs w:val="24"/>
+        </w:rPr>
         <w:lastRenderedPageBreak/>
-        <w:t>Version 1.0.0</w:t>
-      </w:r>
-      <w:bookmarkEnd w:id="0"/>
-    </w:p>
-    <w:p>
-      <w:pPr>
-        <w:rPr>
-          <w:b/>
-          <w:bCs/>
-        </w:rPr>
-      </w:pPr>
+        <w:t>The solution comes with pre-installed folders which would house the Models, Views and Controllers which would be built for the solution.</w:t>
+      </w:r>
+    </w:p>
+    <w:p>
+      <w:pPr>
+        <w:rPr>
+          <w:sz w:val="24"/>
+          <w:szCs w:val="24"/>
+        </w:rPr>
+      </w:pPr>
+      <w:r>
+        <w:rPr>
+          <w:sz w:val="24"/>
+          <w:szCs w:val="24"/>
+        </w:rPr>
+        <w:drawing>
+          <wp:inline distT="0" distB="0" distL="0" distR="0" wp14:anchorId="1A2A6405" wp14:editId="674BD467">
+            <wp:extent cx="2981741" cy="2543530"/>
+            <wp:effectExtent l="0" t="0" r="9525" b="9525"/>
+            <wp:docPr id="7" name="Picture 7"/>
+            <wp:cNvGraphicFramePr>
+              <a:graphicFrameLocks xmlns:a="http://schemas.openxmlformats.org/drawingml/2006/main" noChangeAspect="1"/>
+            </wp:cNvGraphicFramePr>
+            <a:graphic xmlns:a="http://schemas.openxmlformats.org/drawingml/2006/main">
+              <a:graphicData uri="http://schemas.openxmlformats.org/drawingml/2006/picture">
+                <pic:pic xmlns:pic="http://schemas.openxmlformats.org/drawingml/2006/picture">
+                  <pic:nvPicPr>
+                    <pic:cNvPr id="1" name=""/>
+                    <pic:cNvPicPr/>
+                  </pic:nvPicPr>
+                  <pic:blipFill>
+                    <a:blip r:embed="rId8"/>
+                    <a:stretch>
+                      <a:fillRect/>
+                    </a:stretch>
+                  </pic:blipFill>
+                  <pic:spPr>
+                    <a:xfrm>
+                      <a:off x="0" y="0"/>
+                      <a:ext cx="2981741" cy="2543530"/>
+                    </a:xfrm>
+                    <a:prstGeom prst="rect">
+                      <a:avLst/>
+                    </a:prstGeom>
+                  </pic:spPr>
+                </pic:pic>
+              </a:graphicData>
+            </a:graphic>
+          </wp:inline>
+        </w:drawing>
+      </w:r>
+    </w:p>
+    <w:p>
+      <w:pPr>
+        <w:rPr>
+          <w:sz w:val="24"/>
+          <w:szCs w:val="24"/>
+        </w:rPr>
+      </w:pPr>
+      <w:r>
+        <w:rPr>
+          <w:sz w:val="24"/>
+          <w:szCs w:val="24"/>
+        </w:rPr>
+        <w:t>Before we click on the run button, we change the format from HTTPS to HTTP.  After which, we can check whether there are any build errors in the project</w:t>
+      </w:r>
+    </w:p>
+    <w:p>
+      <w:pPr>
+        <w:rPr>
+          <w:sz w:val="24"/>
+          <w:szCs w:val="24"/>
+        </w:rPr>
+      </w:pPr>
+      <w:r>
+        <w:rPr>
+          <w:noProof/>
+          <w:sz w:val="24"/>
+          <w:szCs w:val="24"/>
+        </w:rPr>
+        <w:drawing>
+          <wp:inline distT="0" distB="0" distL="0" distR="0" wp14:anchorId="62539167" wp14:editId="06CDD8E4">
+            <wp:extent cx="590550" cy="390525"/>
+            <wp:effectExtent l="0" t="0" r="0" b="9525"/>
+            <wp:docPr id="1" name="Picture 1"/>
+            <wp:cNvGraphicFramePr>
+              <a:graphicFrameLocks xmlns:a="http://schemas.openxmlformats.org/drawingml/2006/main" noChangeAspect="1"/>
+            </wp:cNvGraphicFramePr>
+            <a:graphic xmlns:a="http://schemas.openxmlformats.org/drawingml/2006/main">
+              <a:graphicData uri="http://schemas.openxmlformats.org/drawingml/2006/picture">
+                <pic:pic xmlns:pic="http://schemas.openxmlformats.org/drawingml/2006/picture">
+                  <pic:nvPicPr>
+                    <pic:cNvPr id="0" name="Picture 6"/>
+                    <pic:cNvPicPr>
+                      <a:picLocks noChangeAspect="1" noChangeArrowheads="1"/>
+                    </pic:cNvPicPr>
+                  </pic:nvPicPr>
+                  <pic:blipFill>
+                    <a:blip r:embed="rId9">
+                      <a:extLst>
+                        <a:ext uri="{28A0092B-C50C-407E-A947-70E740481C1C}">
+                          <a14:useLocalDpi xmlns:a14="http://schemas.microsoft.com/office/drawing/2010/main" val="0"/>
+                        </a:ext>
+                      </a:extLst>
+                    </a:blip>
+                    <a:srcRect/>
+                    <a:stretch>
+                      <a:fillRect/>
+                    </a:stretch>
+                  </pic:blipFill>
+                  <pic:spPr bwMode="auto">
+                    <a:xfrm>
+                      <a:off x="0" y="0"/>
+                      <a:ext cx="590550" cy="390525"/>
+                    </a:xfrm>
+                    <a:prstGeom prst="rect">
+                      <a:avLst/>
+                    </a:prstGeom>
+                    <a:noFill/>
+                    <a:ln>
+                      <a:noFill/>
+                    </a:ln>
+                  </pic:spPr>
+                </pic:pic>
+              </a:graphicData>
+            </a:graphic>
+          </wp:inline>
+        </w:drawing>
+      </w:r>
+    </w:p>
+    <w:p>
+      <w:pPr>
+        <w:rPr>
+          <w:sz w:val="24"/>
+          <w:szCs w:val="24"/>
+        </w:rPr>
+      </w:pPr>
+      <w:r>
+        <w:rPr>
+          <w:sz w:val="24"/>
+          <w:szCs w:val="24"/>
+        </w:rPr>
+        <w:t xml:space="preserve">The Website appears to be functional with four buttons (Home and Privacy), alongside the Register and Log-In. </w:t>
+      </w:r>
+    </w:p>
+    <w:p>
+      <w:pPr>
+        <w:pStyle w:val="Heading3"/>
+        <w:rPr>
+          <w:b/>
+          <w:bCs/>
+        </w:rPr>
+      </w:pPr>
+      <w:bookmarkStart w:id="3" w:name="_Toc226988547"/>
+      <w:r>
+        <w:rPr>
+          <w:b/>
+          <w:bCs/>
+        </w:rPr>
+        <w:t>Models</w:t>
+      </w:r>
+      <w:bookmarkEnd w:id="3"/>
+    </w:p>
+    <w:p>
+      <w:pPr>
+        <w:rPr>
+          <w:sz w:val="24"/>
+          <w:szCs w:val="24"/>
+        </w:rPr>
+      </w:pPr>
+      <w:r>
+        <w:rPr>
+          <w:sz w:val="24"/>
+          <w:szCs w:val="24"/>
+        </w:rPr>
+        <w:t xml:space="preserve">In my initial Entity Relationship diagram, I created models which I deemed appropriate and assigned attributes to each, However, upon creating the models I noticed redundancy in my initial design and made edits to most. I added “MaxUses” and “UsedCount” to the discount model so as to prevent multiple usage of the same discount code, </w:t>
+      </w:r>
+      <w:r>
+        <w:rPr>
+          <w:sz w:val="24"/>
+          <w:szCs w:val="24"/>
+        </w:rPr>
+        <w:t>added</w:t>
+      </w:r>
+      <w:r>
+        <w:rPr>
+          <w:sz w:val="24"/>
+          <w:szCs w:val="24"/>
+        </w:rPr>
+        <w:t xml:space="preserve"> </w:t>
+      </w:r>
+      <w:r>
+        <w:rPr>
+          <w:sz w:val="24"/>
+          <w:szCs w:val="24"/>
+        </w:rPr>
+        <w:t>“</w:t>
+      </w:r>
+      <w:r>
+        <w:rPr>
+          <w:sz w:val="24"/>
+          <w:szCs w:val="24"/>
+        </w:rPr>
+        <w:t>Delivery Type</w:t>
+      </w:r>
+      <w:r>
+        <w:rPr>
+          <w:sz w:val="24"/>
+          <w:szCs w:val="24"/>
+        </w:rPr>
+        <w:t>”</w:t>
+      </w:r>
+      <w:r>
+        <w:rPr>
+          <w:sz w:val="24"/>
+          <w:szCs w:val="24"/>
+        </w:rPr>
+        <w:t xml:space="preserve"> to Order as it was a design requirement I had overseen, </w:t>
+      </w:r>
+      <w:r>
+        <w:rPr>
+          <w:sz w:val="24"/>
+          <w:szCs w:val="24"/>
+        </w:rPr>
+        <w:t>added</w:t>
+      </w:r>
+      <w:r>
+        <w:rPr>
+          <w:sz w:val="24"/>
+          <w:szCs w:val="24"/>
+        </w:rPr>
+        <w:t xml:space="preserve"> price </w:t>
+      </w:r>
+      <w:r>
+        <w:rPr>
+          <w:sz w:val="24"/>
+          <w:szCs w:val="24"/>
+        </w:rPr>
+        <w:t>Attributes (</w:t>
+      </w:r>
+      <w:r>
+        <w:rPr>
+          <w:sz w:val="24"/>
+          <w:szCs w:val="24"/>
+        </w:rPr>
+        <w:t>Unit Price and Total Price)</w:t>
+      </w:r>
+      <w:r>
+        <w:rPr>
+          <w:sz w:val="24"/>
+          <w:szCs w:val="24"/>
+        </w:rPr>
+        <w:t xml:space="preserve"> to Order Products and Basket Products</w:t>
+      </w:r>
+      <w:r>
+        <w:rPr>
+          <w:sz w:val="24"/>
+          <w:szCs w:val="24"/>
+        </w:rPr>
+        <w:t xml:space="preserve">. </w:t>
+      </w:r>
+      <w:r>
+        <w:rPr>
+          <w:sz w:val="24"/>
+          <w:szCs w:val="24"/>
+        </w:rPr>
+        <w:t>I have also added “Status” in Basket as well as removed “Last Update” due to Irrelevance and finally, removed “Is Available” in Product due to redundancy.</w:t>
+      </w:r>
+      <w:r>
+        <w:rPr>
+          <w:sz w:val="24"/>
+          <w:szCs w:val="24"/>
+        </w:rPr>
+        <w:t xml:space="preserve"> </w:t>
+      </w:r>
+    </w:p>
+    <w:p>
+      <w:pPr>
+        <w:rPr>
+          <w:sz w:val="24"/>
+          <w:szCs w:val="24"/>
+        </w:rPr>
+      </w:pPr>
+      <w:r>
+        <w:rPr>
+          <w:sz w:val="24"/>
+          <w:szCs w:val="24"/>
+        </w:rPr>
+        <w:drawing>
+          <wp:inline distT="0" distB="0" distL="0" distR="0" wp14:anchorId="56A247FC" wp14:editId="2AB06E15">
+            <wp:extent cx="2210108" cy="1695687"/>
+            <wp:effectExtent l="0" t="0" r="0" b="0"/>
+            <wp:docPr id="8" name="Picture 8"/>
+            <wp:cNvGraphicFramePr>
+              <a:graphicFrameLocks xmlns:a="http://schemas.openxmlformats.org/drawingml/2006/main" noChangeAspect="1"/>
+            </wp:cNvGraphicFramePr>
+            <a:graphic xmlns:a="http://schemas.openxmlformats.org/drawingml/2006/main">
+              <a:graphicData uri="http://schemas.openxmlformats.org/drawingml/2006/picture">
+                <pic:pic xmlns:pic="http://schemas.openxmlformats.org/drawingml/2006/picture">
+                  <pic:nvPicPr>
+                    <pic:cNvPr id="1" name=""/>
+                    <pic:cNvPicPr/>
+                  </pic:nvPicPr>
+                  <pic:blipFill>
+                    <a:blip r:embed="rId10"/>
+                    <a:stretch>
+                      <a:fillRect/>
+                    </a:stretch>
+                  </pic:blipFill>
+                  <pic:spPr>
+                    <a:xfrm>
+                      <a:off x="0" y="0"/>
+                      <a:ext cx="2210108" cy="1695687"/>
+                    </a:xfrm>
+                    <a:prstGeom prst="rect">
+                      <a:avLst/>
+                    </a:prstGeom>
+                  </pic:spPr>
+                </pic:pic>
+              </a:graphicData>
+            </a:graphic>
+          </wp:inline>
+        </w:drawing>
+      </w:r>
+    </w:p>
+    <w:p>
+      <w:pPr>
+        <w:rPr>
+          <w:sz w:val="24"/>
+          <w:szCs w:val="24"/>
+        </w:rPr>
+      </w:pPr>
+      <w:r>
+        <w:rPr>
+          <w:sz w:val="24"/>
+          <w:szCs w:val="24"/>
+        </w:rPr>
+        <w:t>After Creating the models, I added my first Migration and Updated Database</w:t>
+      </w:r>
+    </w:p>
+    <w:p>
+      <w:pPr>
+        <w:rPr>
+          <w:sz w:val="24"/>
+          <w:szCs w:val="24"/>
+        </w:rPr>
+      </w:pPr>
+      <w:r>
+        <w:rPr>
+          <w:noProof/>
+        </w:rPr>
+        <w:lastRenderedPageBreak/>
+        <w:drawing>
+          <wp:inline distT="0" distB="0" distL="0" distR="0" wp14:anchorId="22E12F17" wp14:editId="77C58F03">
+            <wp:extent cx="2990850" cy="733425"/>
+            <wp:effectExtent l="0" t="0" r="0" b="9525"/>
+            <wp:docPr id="11" name="Picture 11"/>
+            <wp:cNvGraphicFramePr/>
+            <a:graphic xmlns:a="http://schemas.openxmlformats.org/drawingml/2006/main">
+              <a:graphicData uri="http://schemas.openxmlformats.org/drawingml/2006/picture">
+                <pic:pic xmlns:pic="http://schemas.openxmlformats.org/drawingml/2006/picture">
+                  <pic:nvPicPr>
+                    <pic:cNvPr id="11" name="Picture 11"/>
+                    <pic:cNvPicPr/>
+                  </pic:nvPicPr>
+                  <pic:blipFill>
+                    <a:blip r:embed="rId11"/>
+                    <a:stretch>
+                      <a:fillRect/>
+                    </a:stretch>
+                  </pic:blipFill>
+                  <pic:spPr>
+                    <a:xfrm>
+                      <a:off x="0" y="0"/>
+                      <a:ext cx="2990850" cy="733425"/>
+                    </a:xfrm>
+                    <a:prstGeom prst="rect">
+                      <a:avLst/>
+                    </a:prstGeom>
+                  </pic:spPr>
+                </pic:pic>
+              </a:graphicData>
+            </a:graphic>
+          </wp:inline>
+        </w:drawing>
+      </w:r>
+      <w:r>
+        <w:rPr>
+          <w:noProof/>
+        </w:rPr>
+        <w:drawing>
+          <wp:inline distT="0" distB="0" distL="0" distR="0" wp14:anchorId="4244E566" wp14:editId="611CA6B9">
+            <wp:extent cx="1885950" cy="742950"/>
+            <wp:effectExtent l="0" t="0" r="0" b="0"/>
+            <wp:docPr id="13" name="Picture 13"/>
+            <wp:cNvGraphicFramePr/>
+            <a:graphic xmlns:a="http://schemas.openxmlformats.org/drawingml/2006/main">
+              <a:graphicData uri="http://schemas.openxmlformats.org/drawingml/2006/picture">
+                <pic:pic xmlns:pic="http://schemas.openxmlformats.org/drawingml/2006/picture">
+                  <pic:nvPicPr>
+                    <pic:cNvPr id="13" name="Picture 13"/>
+                    <pic:cNvPicPr/>
+                  </pic:nvPicPr>
+                  <pic:blipFill>
+                    <a:blip r:embed="rId12"/>
+                    <a:stretch>
+                      <a:fillRect/>
+                    </a:stretch>
+                  </pic:blipFill>
+                  <pic:spPr>
+                    <a:xfrm>
+                      <a:off x="0" y="0"/>
+                      <a:ext cx="1885950" cy="742950"/>
+                    </a:xfrm>
+                    <a:prstGeom prst="rect">
+                      <a:avLst/>
+                    </a:prstGeom>
+                  </pic:spPr>
+                </pic:pic>
+              </a:graphicData>
+            </a:graphic>
+          </wp:inline>
+        </w:drawing>
+      </w:r>
+    </w:p>
+    <w:p/>
+    <w:p>
+      <w:pPr>
+        <w:rPr>
+          <w:sz w:val="24"/>
+          <w:szCs w:val="24"/>
+        </w:rPr>
+      </w:pPr>
+      <w:r>
+        <w:rPr>
+          <w:sz w:val="24"/>
+          <w:szCs w:val="24"/>
+        </w:rPr>
+        <w:t>I did edit the Producer model as well, removing the “LastName” attribute and renaming the “FirstName” attribute to “ProducerName”</w:t>
+      </w:r>
+      <w:r>
+        <w:rPr>
+          <w:sz w:val="24"/>
+          <w:szCs w:val="24"/>
+        </w:rPr>
+        <w:t>. Next, I scaffolded my models which ended up creating views and controllers for each respective model.</w:t>
+      </w:r>
+    </w:p>
+    <w:p>
+      <w:r>
+        <w:drawing>
+          <wp:inline distT="0" distB="0" distL="0" distR="0" wp14:anchorId="601EA7DC" wp14:editId="7FB3D791">
+            <wp:extent cx="2819400" cy="3448050"/>
+            <wp:effectExtent l="0" t="0" r="0" b="0"/>
+            <wp:docPr id="9" name="Picture 9"/>
+            <wp:cNvGraphicFramePr>
+              <a:graphicFrameLocks xmlns:a="http://schemas.openxmlformats.org/drawingml/2006/main" noChangeAspect="1"/>
+            </wp:cNvGraphicFramePr>
+            <a:graphic xmlns:a="http://schemas.openxmlformats.org/drawingml/2006/main">
+              <a:graphicData uri="http://schemas.openxmlformats.org/drawingml/2006/picture">
+                <pic:pic xmlns:pic="http://schemas.openxmlformats.org/drawingml/2006/picture">
+                  <pic:nvPicPr>
+                    <pic:cNvPr id="1" name=""/>
+                    <pic:cNvPicPr/>
+                  </pic:nvPicPr>
+                  <pic:blipFill>
+                    <a:blip r:embed="rId13"/>
+                    <a:stretch>
+                      <a:fillRect/>
+                    </a:stretch>
+                  </pic:blipFill>
+                  <pic:spPr>
+                    <a:xfrm>
+                      <a:off x="0" y="0"/>
+                      <a:ext cx="2838553" cy="3471474"/>
+                    </a:xfrm>
+                    <a:prstGeom prst="rect">
+                      <a:avLst/>
+                    </a:prstGeom>
+                  </pic:spPr>
+                </pic:pic>
+              </a:graphicData>
+            </a:graphic>
+          </wp:inline>
+        </w:drawing>
+      </w:r>
+    </w:p>
+    <w:p>
+      <w:r>
+        <w:t xml:space="preserve"> I then added navigation Links to each of these for ease the development process </w:t>
+      </w:r>
+      <w:r>
+        <w:t>as well as a added a placeholder Logo</w:t>
+      </w:r>
+      <w:r>
+        <w:drawing>
+          <wp:inline distT="0" distB="0" distL="0" distR="0" wp14:anchorId="22106D48" wp14:editId="2C102032">
+            <wp:extent cx="5731510" cy="793115"/>
+            <wp:effectExtent l="0" t="0" r="2540" b="6985"/>
+            <wp:docPr id="12" name="Picture 12"/>
+            <wp:cNvGraphicFramePr>
+              <a:graphicFrameLocks xmlns:a="http://schemas.openxmlformats.org/drawingml/2006/main" noChangeAspect="1"/>
+            </wp:cNvGraphicFramePr>
+            <a:graphic xmlns:a="http://schemas.openxmlformats.org/drawingml/2006/main">
+              <a:graphicData uri="http://schemas.openxmlformats.org/drawingml/2006/picture">
+                <pic:pic xmlns:pic="http://schemas.openxmlformats.org/drawingml/2006/picture">
+                  <pic:nvPicPr>
+                    <pic:cNvPr id="1" name=""/>
+                    <pic:cNvPicPr/>
+                  </pic:nvPicPr>
+                  <pic:blipFill>
+                    <a:blip r:embed="rId14"/>
+                    <a:stretch>
+                      <a:fillRect/>
+                    </a:stretch>
+                  </pic:blipFill>
+                  <pic:spPr>
+                    <a:xfrm>
+                      <a:off x="0" y="0"/>
+                      <a:ext cx="5731510" cy="793115"/>
+                    </a:xfrm>
+                    <a:prstGeom prst="rect">
+                      <a:avLst/>
+                    </a:prstGeom>
+                  </pic:spPr>
+                </pic:pic>
+              </a:graphicData>
+            </a:graphic>
+          </wp:inline>
+        </w:drawing>
+      </w:r>
+    </w:p>
+    <w:p>
+      <w:r>
+        <w:t xml:space="preserve">I then created a new file called seed data. This would essentially hold pre placed data which would be visible across the website.    </w:t>
+      </w:r>
+    </w:p>
+    <w:p>
+      <w:pPr>
+        <w:rPr>
+          <w:noProof/>
+        </w:rPr>
+      </w:pPr>
+      <w:r>
+        <w:rPr>
+          <w:noProof/>
+        </w:rPr>
+        <w:t xml:space="preserve"> </w:t>
+      </w:r>
+      <w:r>
+        <w:drawing>
+          <wp:inline distT="0" distB="0" distL="0" distR="0" wp14:anchorId="1B926626" wp14:editId="5A659286">
+            <wp:extent cx="1752845" cy="295316"/>
+            <wp:effectExtent l="0" t="0" r="0" b="9525"/>
+            <wp:docPr id="14" name="Picture 14"/>
+            <wp:cNvGraphicFramePr>
+              <a:graphicFrameLocks xmlns:a="http://schemas.openxmlformats.org/drawingml/2006/main" noChangeAspect="1"/>
+            </wp:cNvGraphicFramePr>
+            <a:graphic xmlns:a="http://schemas.openxmlformats.org/drawingml/2006/main">
+              <a:graphicData uri="http://schemas.openxmlformats.org/drawingml/2006/picture">
+                <pic:pic xmlns:pic="http://schemas.openxmlformats.org/drawingml/2006/picture">
+                  <pic:nvPicPr>
+                    <pic:cNvPr id="1" name=""/>
+                    <pic:cNvPicPr/>
+                  </pic:nvPicPr>
+                  <pic:blipFill>
+                    <a:blip r:embed="rId15"/>
+                    <a:stretch>
+                      <a:fillRect/>
+                    </a:stretch>
+                  </pic:blipFill>
+                  <pic:spPr>
+                    <a:xfrm>
+                      <a:off x="0" y="0"/>
+                      <a:ext cx="1752845" cy="295316"/>
+                    </a:xfrm>
+                    <a:prstGeom prst="rect">
+                      <a:avLst/>
+                    </a:prstGeom>
+                  </pic:spPr>
+                </pic:pic>
+              </a:graphicData>
+            </a:graphic>
+          </wp:inline>
+        </w:drawing>
+      </w:r>
+    </w:p>
+    <w:p>
+      <w:pPr>
+        <w:rPr>
+          <w:noProof/>
+        </w:rPr>
+      </w:pPr>
+      <w:r>
+        <w:rPr>
+          <w:noProof/>
+        </w:rPr>
+        <w:t>I created a seed roles function for an admin i.e created an admin account</w:t>
+      </w:r>
+    </w:p>
+    <w:p>
+      <w:r>
+        <w:drawing>
+          <wp:inline distT="0" distB="0" distL="0" distR="0" wp14:anchorId="72B3D594" wp14:editId="78158586">
+            <wp:extent cx="4686954" cy="571580"/>
+            <wp:effectExtent l="0" t="0" r="0" b="0"/>
+            <wp:docPr id="15" name="Picture 15"/>
+            <wp:cNvGraphicFramePr>
+              <a:graphicFrameLocks xmlns:a="http://schemas.openxmlformats.org/drawingml/2006/main" noChangeAspect="1"/>
+            </wp:cNvGraphicFramePr>
+            <a:graphic xmlns:a="http://schemas.openxmlformats.org/drawingml/2006/main">
+              <a:graphicData uri="http://schemas.openxmlformats.org/drawingml/2006/picture">
+                <pic:pic xmlns:pic="http://schemas.openxmlformats.org/drawingml/2006/picture">
+                  <pic:nvPicPr>
+                    <pic:cNvPr id="1" name=""/>
+                    <pic:cNvPicPr/>
+                  </pic:nvPicPr>
+                  <pic:blipFill>
+                    <a:blip r:embed="rId16"/>
+                    <a:stretch>
+                      <a:fillRect/>
+                    </a:stretch>
+                  </pic:blipFill>
+                  <pic:spPr>
+                    <a:xfrm>
+                      <a:off x="0" y="0"/>
+                      <a:ext cx="4686954" cy="571580"/>
+                    </a:xfrm>
+                    <a:prstGeom prst="rect">
+                      <a:avLst/>
+                    </a:prstGeom>
+                  </pic:spPr>
+                </pic:pic>
+              </a:graphicData>
+            </a:graphic>
+          </wp:inline>
+        </w:drawing>
+      </w:r>
+    </w:p>
+    <w:p>
+      <w:pPr>
+        <w:rPr>
+          <w:b/>
+          <w:bCs/>
+        </w:rPr>
+      </w:pPr>
+      <w:r>
+        <w:rPr>
+          <w:b/>
+          <w:bCs/>
+        </w:rPr>
+        <w:t xml:space="preserve">Today </w:t>
+      </w:r>
+    </w:p>
+    <w:p>
+      <w:r>
+        <w:lastRenderedPageBreak/>
+        <w:t>I have been able to;</w:t>
+      </w:r>
+    </w:p>
+    <w:p>
+      <w:pPr>
+        <w:pStyle w:val="ListParagraph"/>
+        <w:numPr>
+          <w:ilvl w:val="0"/>
+          <w:numId w:val="3"/>
+        </w:numPr>
+      </w:pPr>
+      <w:r>
+        <w:t xml:space="preserve">Created the web project using ASP.NET core MVC. </w:t>
+      </w:r>
+    </w:p>
+    <w:p>
+      <w:pPr>
+        <w:pStyle w:val="ListParagraph"/>
+        <w:numPr>
+          <w:ilvl w:val="0"/>
+          <w:numId w:val="3"/>
+        </w:numPr>
+      </w:pPr>
+      <w:r>
+        <w:t>Created the models for the project which are essentially the same in the entity relationship diagram</w:t>
+      </w:r>
+    </w:p>
+    <w:p>
+      <w:pPr>
+        <w:pStyle w:val="ListParagraph"/>
+        <w:numPr>
+          <w:ilvl w:val="0"/>
+          <w:numId w:val="3"/>
+        </w:numPr>
+      </w:pPr>
+      <w:r>
+        <w:t xml:space="preserve">Scaffolded those models </w:t>
+      </w:r>
+      <w:r>
+        <w:t>which created their views and controllers</w:t>
+      </w:r>
+    </w:p>
+    <w:p>
+      <w:pPr>
+        <w:pStyle w:val="ListParagraph"/>
+        <w:numPr>
+          <w:ilvl w:val="0"/>
+          <w:numId w:val="3"/>
+        </w:numPr>
+      </w:pPr>
+      <w:r>
+        <w:t>Added appropriate migration and updated databases</w:t>
+      </w:r>
+    </w:p>
+    <w:p>
+      <w:pPr>
+        <w:pStyle w:val="ListParagraph"/>
+        <w:numPr>
+          <w:ilvl w:val="0"/>
+          <w:numId w:val="3"/>
+        </w:numPr>
+      </w:pPr>
+      <w:r>
+        <w:t xml:space="preserve">Added Navigation Links so as to allow me navigate through the different webpages </w:t>
+      </w:r>
+    </w:p>
+    <w:p>
+      <w:pPr>
+        <w:pStyle w:val="ListParagraph"/>
+        <w:numPr>
+          <w:ilvl w:val="0"/>
+          <w:numId w:val="3"/>
+        </w:numPr>
+      </w:pPr>
+      <w:r>
+        <w:t xml:space="preserve">Create seed data file and </w:t>
+      </w:r>
+      <w:r>
+        <w:t>seeded Roles for an admin.</w:t>
+      </w:r>
+    </w:p>
+    <w:p/>
+    <w:p>
+      <w:pPr>
+        <w:rPr>
+          <w:b/>
+          <w:bCs/>
+        </w:rPr>
+      </w:pPr>
+      <w:r>
+        <w:rPr>
+          <w:b/>
+          <w:bCs/>
+        </w:rPr>
+        <w:t>Tomorrow</w:t>
+      </w:r>
+    </w:p>
+    <w:p>
+      <w:r>
+        <w:t>I wish to;</w:t>
+      </w:r>
+    </w:p>
+    <w:p>
+      <w:pPr>
+        <w:pStyle w:val="ListParagraph"/>
+        <w:numPr>
+          <w:ilvl w:val="0"/>
+          <w:numId w:val="4"/>
+        </w:numPr>
+      </w:pPr>
+      <w:r>
+        <w:t>Finish seeding all Roles</w:t>
+      </w:r>
+    </w:p>
+    <w:p>
+      <w:pPr>
+        <w:pStyle w:val="ListParagraph"/>
+        <w:numPr>
+          <w:ilvl w:val="0"/>
+          <w:numId w:val="4"/>
+        </w:numPr>
+      </w:pPr>
+      <w:r>
+        <w:t>Seed users i.e., producers</w:t>
+      </w:r>
+    </w:p>
+    <w:p>
+      <w:pPr>
+        <w:pStyle w:val="ListParagraph"/>
+        <w:numPr>
+          <w:ilvl w:val="0"/>
+          <w:numId w:val="4"/>
+        </w:numPr>
+      </w:pPr>
+      <w:r>
+        <w:t>Seed products</w:t>
+      </w:r>
+    </w:p>
+    <w:p>
+      <w:pPr>
+        <w:pStyle w:val="ListParagraph"/>
+        <w:numPr>
+          <w:ilvl w:val="0"/>
+          <w:numId w:val="4"/>
+        </w:numPr>
+      </w:pPr>
+      <w:r>
+        <w:t>Test for successful seeding process</w:t>
+      </w:r>
+    </w:p>
+    <w:p>
+      <w:pPr>
+        <w:pStyle w:val="ListParagraph"/>
+        <w:numPr>
+          <w:ilvl w:val="0"/>
+          <w:numId w:val="4"/>
+        </w:numPr>
+      </w:pPr>
+      <w:r>
+        <w:t>Create basic functionality</w:t>
+      </w:r>
+    </w:p>
+    <w:p>
+      <w:pPr>
+        <w:pStyle w:val="ListParagraph"/>
+        <w:numPr>
+          <w:ilvl w:val="0"/>
+          <w:numId w:val="4"/>
+        </w:numPr>
+      </w:pPr>
+      <w:r>
+        <w:t xml:space="preserve">Work on controller Logic </w:t>
+      </w:r>
+    </w:p>
+    <w:p/>
+    <w:p>
+      <w:pPr>
+        <w:pStyle w:val="Heading2"/>
+        <w:rPr>
+          <w:b/>
+          <w:bCs/>
+        </w:rPr>
+      </w:pPr>
+      <w:r>
+        <w:rPr>
+          <w:b/>
+          <w:bCs/>
+        </w:rPr>
+        <w:t>Day 2</w:t>
+      </w:r>
     </w:p>
     <w:sectPr>
       <w:pgSz w:w="11906" w:h="16838"/>
@@ -1437,6 +2910,362 @@
     </w:sectPr>
   </w:body>
 </w:document>
+</file>
+
+<file path=word/numbering.xml><?xml version="1.0" encoding="utf-8"?>
+<w:numbering xmlns:wpc="http://schemas.microsoft.com/office/word/2010/wordprocessingCanvas" xmlns:cx="http://schemas.microsoft.com/office/drawing/2014/chartex" xmlns:cx1="http://schemas.microsoft.com/office/drawing/2015/9/8/chartex" xmlns:cx2="http://schemas.microsoft.com/office/drawing/2015/10/21/chartex" xmlns:cx3="http://schemas.microsoft.com/office/drawing/2016/5/9/chartex" xmlns:cx4="http://schemas.microsoft.com/office/drawing/2016/5/10/chartex" xmlns:cx5="http://schemas.microsoft.com/office/drawing/2016/5/11/chartex" xmlns:cx6="http://schemas.microsoft.com/office/drawing/2016/5/12/chartex" xmlns:cx7="http://schemas.microsoft.com/office/drawing/2016/5/13/chartex" xmlns:cx8="http://schemas.microsoft.com/office/drawing/2016/5/14/chartex" xmlns:mc="http://schemas.openxmlformats.org/markup-compatibility/2006" xmlns:aink="http://schemas.microsoft.com/office/drawing/2016/ink" xmlns:am3d="http://schemas.microsoft.com/office/drawing/2017/model3d" xmlns:o="urn:schemas-microsoft-com:office:office" xmlns:r="http://schemas.openxmlformats.org/officeDocument/2006/relationships" xmlns:m="http://schemas.openxmlformats.org/officeDocument/2006/math" xmlns:v="urn:schemas-microsoft-com:vml" xmlns:wp14="http://schemas.microsoft.com/office/word/2010/wordprocessingDrawing" xmlns:wp="http://schemas.openxmlformats.org/drawingml/2006/wordprocessingDrawing" xmlns:w10="urn:schemas-microsoft-com:office:word" xmlns:w="http://schemas.openxmlformats.org/wordprocessingml/2006/main" xmlns:w14="http://schemas.microsoft.com/office/word/2010/wordml" xmlns:w15="http://schemas.microsoft.com/office/word/2012/wordml" xmlns:w16cex="http://schemas.microsoft.com/office/word/2018/wordml/cex" xmlns:w16cid="http://schemas.microsoft.com/office/word/2016/wordml/cid" xmlns:w16="http://schemas.microsoft.com/office/word/2018/wordml" xmlns:w16sdtdh="http://schemas.microsoft.com/office/word/2020/wordml/sdtdatahash" xmlns:w16se="http://schemas.microsoft.com/office/word/2015/wordml/symex" xmlns:wpg="http://schemas.microsoft.com/office/word/2010/wordprocessingGroup" xmlns:wpi="http://schemas.microsoft.com/office/word/2010/wordprocessingInk" xmlns:wne="http://schemas.microsoft.com/office/word/2006/wordml" xmlns:wps="http://schemas.microsoft.com/office/word/2010/wordprocessingShape" mc:Ignorable="w14 w15 w16se w16cid w16 w16cex w16sdtdh wp14">
+  <w:abstractNum w:abstractNumId="0" w15:restartNumberingAfterBreak="0">
+    <w:nsid w:val="0BFC7600"/>
+    <w:multiLevelType w:val="hybridMultilevel"/>
+    <w:tmpl w:val="60EEE33A"/>
+    <w:lvl w:ilvl="0" w:tplc="0809000F">
+      <w:start w:val="1"/>
+      <w:numFmt w:val="decimal"/>
+      <w:lvlText w:val="%1."/>
+      <w:lvlJc w:val="left"/>
+      <w:pPr>
+        <w:ind w:left="720" w:hanging="360"/>
+      </w:pPr>
+    </w:lvl>
+    <w:lvl w:ilvl="1" w:tplc="08090019">
+      <w:start w:val="1"/>
+      <w:numFmt w:val="lowerLetter"/>
+      <w:lvlText w:val="%2."/>
+      <w:lvlJc w:val="left"/>
+      <w:pPr>
+        <w:ind w:left="1440" w:hanging="360"/>
+      </w:pPr>
+    </w:lvl>
+    <w:lvl w:ilvl="2" w:tplc="0809001B">
+      <w:start w:val="1"/>
+      <w:numFmt w:val="lowerRoman"/>
+      <w:lvlText w:val="%3."/>
+      <w:lvlJc w:val="right"/>
+      <w:pPr>
+        <w:ind w:left="2160" w:hanging="180"/>
+      </w:pPr>
+    </w:lvl>
+    <w:lvl w:ilvl="3" w:tplc="0809000F">
+      <w:start w:val="1"/>
+      <w:numFmt w:val="decimal"/>
+      <w:lvlText w:val="%4."/>
+      <w:lvlJc w:val="left"/>
+      <w:pPr>
+        <w:ind w:left="2880" w:hanging="360"/>
+      </w:pPr>
+    </w:lvl>
+    <w:lvl w:ilvl="4" w:tplc="08090019">
+      <w:start w:val="1"/>
+      <w:numFmt w:val="lowerLetter"/>
+      <w:lvlText w:val="%5."/>
+      <w:lvlJc w:val="left"/>
+      <w:pPr>
+        <w:ind w:left="3600" w:hanging="360"/>
+      </w:pPr>
+    </w:lvl>
+    <w:lvl w:ilvl="5" w:tplc="0809001B">
+      <w:start w:val="1"/>
+      <w:numFmt w:val="lowerRoman"/>
+      <w:lvlText w:val="%6."/>
+      <w:lvlJc w:val="right"/>
+      <w:pPr>
+        <w:ind w:left="4320" w:hanging="180"/>
+      </w:pPr>
+    </w:lvl>
+    <w:lvl w:ilvl="6" w:tplc="0809000F">
+      <w:start w:val="1"/>
+      <w:numFmt w:val="decimal"/>
+      <w:lvlText w:val="%7."/>
+      <w:lvlJc w:val="left"/>
+      <w:pPr>
+        <w:ind w:left="5040" w:hanging="360"/>
+      </w:pPr>
+    </w:lvl>
+    <w:lvl w:ilvl="7" w:tplc="08090019">
+      <w:start w:val="1"/>
+      <w:numFmt w:val="lowerLetter"/>
+      <w:lvlText w:val="%8."/>
+      <w:lvlJc w:val="left"/>
+      <w:pPr>
+        <w:ind w:left="5760" w:hanging="360"/>
+      </w:pPr>
+    </w:lvl>
+    <w:lvl w:ilvl="8" w:tplc="0809001B">
+      <w:start w:val="1"/>
+      <w:numFmt w:val="lowerRoman"/>
+      <w:lvlText w:val="%9."/>
+      <w:lvlJc w:val="right"/>
+      <w:pPr>
+        <w:ind w:left="6480" w:hanging="180"/>
+      </w:pPr>
+    </w:lvl>
+  </w:abstractNum>
+  <w:abstractNum w:abstractNumId="1" w15:restartNumberingAfterBreak="0">
+    <w:nsid w:val="7065146D"/>
+    <w:multiLevelType w:val="hybridMultilevel"/>
+    <w:tmpl w:val="B1EC464A"/>
+    <w:lvl w:ilvl="0" w:tplc="08090001">
+      <w:start w:val="1"/>
+      <w:numFmt w:val="bullet"/>
+      <w:lvlText w:val=""/>
+      <w:lvlJc w:val="left"/>
+      <w:pPr>
+        <w:ind w:left="765" w:hanging="360"/>
+      </w:pPr>
+      <w:rPr>
+        <w:rFonts w:ascii="Symbol" w:hAnsi="Symbol" w:hint="default"/>
+      </w:rPr>
+    </w:lvl>
+    <w:lvl w:ilvl="1" w:tplc="08090003" w:tentative="1">
+      <w:start w:val="1"/>
+      <w:numFmt w:val="bullet"/>
+      <w:lvlText w:val="o"/>
+      <w:lvlJc w:val="left"/>
+      <w:pPr>
+        <w:ind w:left="1485" w:hanging="360"/>
+      </w:pPr>
+      <w:rPr>
+        <w:rFonts w:ascii="Courier New" w:hAnsi="Courier New" w:cs="Courier New" w:hint="default"/>
+      </w:rPr>
+    </w:lvl>
+    <w:lvl w:ilvl="2" w:tplc="08090005" w:tentative="1">
+      <w:start w:val="1"/>
+      <w:numFmt w:val="bullet"/>
+      <w:lvlText w:val=""/>
+      <w:lvlJc w:val="left"/>
+      <w:pPr>
+        <w:ind w:left="2205" w:hanging="360"/>
+      </w:pPr>
+      <w:rPr>
+        <w:rFonts w:ascii="Wingdings" w:hAnsi="Wingdings" w:hint="default"/>
+      </w:rPr>
+    </w:lvl>
+    <w:lvl w:ilvl="3" w:tplc="08090001" w:tentative="1">
+      <w:start w:val="1"/>
+      <w:numFmt w:val="bullet"/>
+      <w:lvlText w:val=""/>
+      <w:lvlJc w:val="left"/>
+      <w:pPr>
+        <w:ind w:left="2925" w:hanging="360"/>
+      </w:pPr>
+      <w:rPr>
+        <w:rFonts w:ascii="Symbol" w:hAnsi="Symbol" w:hint="default"/>
+      </w:rPr>
+    </w:lvl>
+    <w:lvl w:ilvl="4" w:tplc="08090003" w:tentative="1">
+      <w:start w:val="1"/>
+      <w:numFmt w:val="bullet"/>
+      <w:lvlText w:val="o"/>
+      <w:lvlJc w:val="left"/>
+      <w:pPr>
+        <w:ind w:left="3645" w:hanging="360"/>
+      </w:pPr>
+      <w:rPr>
+        <w:rFonts w:ascii="Courier New" w:hAnsi="Courier New" w:cs="Courier New" w:hint="default"/>
+      </w:rPr>
+    </w:lvl>
+    <w:lvl w:ilvl="5" w:tplc="08090005" w:tentative="1">
+      <w:start w:val="1"/>
+      <w:numFmt w:val="bullet"/>
+      <w:lvlText w:val=""/>
+      <w:lvlJc w:val="left"/>
+      <w:pPr>
+        <w:ind w:left="4365" w:hanging="360"/>
+      </w:pPr>
+      <w:rPr>
+        <w:rFonts w:ascii="Wingdings" w:hAnsi="Wingdings" w:hint="default"/>
+      </w:rPr>
+    </w:lvl>
+    <w:lvl w:ilvl="6" w:tplc="08090001" w:tentative="1">
+      <w:start w:val="1"/>
+      <w:numFmt w:val="bullet"/>
+      <w:lvlText w:val=""/>
+      <w:lvlJc w:val="left"/>
+      <w:pPr>
+        <w:ind w:left="5085" w:hanging="360"/>
+      </w:pPr>
+      <w:rPr>
+        <w:rFonts w:ascii="Symbol" w:hAnsi="Symbol" w:hint="default"/>
+      </w:rPr>
+    </w:lvl>
+    <w:lvl w:ilvl="7" w:tplc="08090003" w:tentative="1">
+      <w:start w:val="1"/>
+      <w:numFmt w:val="bullet"/>
+      <w:lvlText w:val="o"/>
+      <w:lvlJc w:val="left"/>
+      <w:pPr>
+        <w:ind w:left="5805" w:hanging="360"/>
+      </w:pPr>
+      <w:rPr>
+        <w:rFonts w:ascii="Courier New" w:hAnsi="Courier New" w:cs="Courier New" w:hint="default"/>
+      </w:rPr>
+    </w:lvl>
+    <w:lvl w:ilvl="8" w:tplc="08090005" w:tentative="1">
+      <w:start w:val="1"/>
+      <w:numFmt w:val="bullet"/>
+      <w:lvlText w:val=""/>
+      <w:lvlJc w:val="left"/>
+      <w:pPr>
+        <w:ind w:left="6525" w:hanging="360"/>
+      </w:pPr>
+      <w:rPr>
+        <w:rFonts w:ascii="Wingdings" w:hAnsi="Wingdings" w:hint="default"/>
+      </w:rPr>
+    </w:lvl>
+  </w:abstractNum>
+  <w:abstractNum w:abstractNumId="2" w15:restartNumberingAfterBreak="0">
+    <w:nsid w:val="71F0464D"/>
+    <w:multiLevelType w:val="hybridMultilevel"/>
+    <w:tmpl w:val="8D6A91A2"/>
+    <w:lvl w:ilvl="0" w:tplc="08090001">
+      <w:start w:val="1"/>
+      <w:numFmt w:val="bullet"/>
+      <w:lvlText w:val=""/>
+      <w:lvlJc w:val="left"/>
+      <w:pPr>
+        <w:ind w:left="720" w:hanging="360"/>
+      </w:pPr>
+      <w:rPr>
+        <w:rFonts w:ascii="Symbol" w:hAnsi="Symbol" w:hint="default"/>
+      </w:rPr>
+    </w:lvl>
+    <w:lvl w:ilvl="1" w:tplc="08090003" w:tentative="1">
+      <w:start w:val="1"/>
+      <w:numFmt w:val="bullet"/>
+      <w:lvlText w:val="o"/>
+      <w:lvlJc w:val="left"/>
+      <w:pPr>
+        <w:ind w:left="1440" w:hanging="360"/>
+      </w:pPr>
+      <w:rPr>
+        <w:rFonts w:ascii="Courier New" w:hAnsi="Courier New" w:cs="Courier New" w:hint="default"/>
+      </w:rPr>
+    </w:lvl>
+    <w:lvl w:ilvl="2" w:tplc="08090005" w:tentative="1">
+      <w:start w:val="1"/>
+      <w:numFmt w:val="bullet"/>
+      <w:lvlText w:val=""/>
+      <w:lvlJc w:val="left"/>
+      <w:pPr>
+        <w:ind w:left="2160" w:hanging="360"/>
+      </w:pPr>
+      <w:rPr>
+        <w:rFonts w:ascii="Wingdings" w:hAnsi="Wingdings" w:hint="default"/>
+      </w:rPr>
+    </w:lvl>
+    <w:lvl w:ilvl="3" w:tplc="08090001" w:tentative="1">
+      <w:start w:val="1"/>
+      <w:numFmt w:val="bullet"/>
+      <w:lvlText w:val=""/>
+      <w:lvlJc w:val="left"/>
+      <w:pPr>
+        <w:ind w:left="2880" w:hanging="360"/>
+      </w:pPr>
+      <w:rPr>
+        <w:rFonts w:ascii="Symbol" w:hAnsi="Symbol" w:hint="default"/>
+      </w:rPr>
+    </w:lvl>
+    <w:lvl w:ilvl="4" w:tplc="08090003" w:tentative="1">
+      <w:start w:val="1"/>
+      <w:numFmt w:val="bullet"/>
+      <w:lvlText w:val="o"/>
+      <w:lvlJc w:val="left"/>
+      <w:pPr>
+        <w:ind w:left="3600" w:hanging="360"/>
+      </w:pPr>
+      <w:rPr>
+        <w:rFonts w:ascii="Courier New" w:hAnsi="Courier New" w:cs="Courier New" w:hint="default"/>
+      </w:rPr>
+    </w:lvl>
+    <w:lvl w:ilvl="5" w:tplc="08090005" w:tentative="1">
+      <w:start w:val="1"/>
+      <w:numFmt w:val="bullet"/>
+      <w:lvlText w:val=""/>
+      <w:lvlJc w:val="left"/>
+      <w:pPr>
+        <w:ind w:left="4320" w:hanging="360"/>
+      </w:pPr>
+      <w:rPr>
+        <w:rFonts w:ascii="Wingdings" w:hAnsi="Wingdings" w:hint="default"/>
+      </w:rPr>
+    </w:lvl>
+    <w:lvl w:ilvl="6" w:tplc="08090001" w:tentative="1">
+      <w:start w:val="1"/>
+      <w:numFmt w:val="bullet"/>
+      <w:lvlText w:val=""/>
+      <w:lvlJc w:val="left"/>
+      <w:pPr>
+        <w:ind w:left="5040" w:hanging="360"/>
+      </w:pPr>
+      <w:rPr>
+        <w:rFonts w:ascii="Symbol" w:hAnsi="Symbol" w:hint="default"/>
+      </w:rPr>
+    </w:lvl>
+    <w:lvl w:ilvl="7" w:tplc="08090003" w:tentative="1">
+      <w:start w:val="1"/>
+      <w:numFmt w:val="bullet"/>
+      <w:lvlText w:val="o"/>
+      <w:lvlJc w:val="left"/>
+      <w:pPr>
+        <w:ind w:left="5760" w:hanging="360"/>
+      </w:pPr>
+      <w:rPr>
+        <w:rFonts w:ascii="Courier New" w:hAnsi="Courier New" w:cs="Courier New" w:hint="default"/>
+      </w:rPr>
+    </w:lvl>
+    <w:lvl w:ilvl="8" w:tplc="08090005" w:tentative="1">
+      <w:start w:val="1"/>
+      <w:numFmt w:val="bullet"/>
+      <w:lvlText w:val=""/>
+      <w:lvlJc w:val="left"/>
+      <w:pPr>
+        <w:ind w:left="6480" w:hanging="360"/>
+      </w:pPr>
+      <w:rPr>
+        <w:rFonts w:ascii="Wingdings" w:hAnsi="Wingdings" w:hint="default"/>
+      </w:rPr>
+    </w:lvl>
+  </w:abstractNum>
+  <w:num w:numId="1">
+    <w:abstractNumId w:val="0"/>
+    <w:lvlOverride w:ilvl="0">
+      <w:startOverride w:val="1"/>
+    </w:lvlOverride>
+    <w:lvlOverride w:ilvl="1">
+      <w:startOverride w:val="1"/>
+    </w:lvlOverride>
+    <w:lvlOverride w:ilvl="2">
+      <w:startOverride w:val="1"/>
+    </w:lvlOverride>
+    <w:lvlOverride w:ilvl="3">
+      <w:startOverride w:val="1"/>
+    </w:lvlOverride>
+    <w:lvlOverride w:ilvl="4">
+      <w:startOverride w:val="1"/>
+    </w:lvlOverride>
+    <w:lvlOverride w:ilvl="5">
+      <w:startOverride w:val="1"/>
+    </w:lvlOverride>
+    <w:lvlOverride w:ilvl="6">
+      <w:startOverride w:val="1"/>
+    </w:lvlOverride>
+    <w:lvlOverride w:ilvl="7">
+      <w:startOverride w:val="1"/>
+    </w:lvlOverride>
+    <w:lvlOverride w:ilvl="8">
+      <w:startOverride w:val="1"/>
+    </w:lvlOverride>
+  </w:num>
+  <w:num w:numId="2">
+    <w:abstractNumId w:val="0"/>
+  </w:num>
+  <w:num w:numId="3">
+    <w:abstractNumId w:val="2"/>
+  </w:num>
+  <w:num w:numId="4">
+    <w:abstractNumId w:val="1"/>
+  </w:num>
+</w:numbering>
 </file>
 
 <file path=word/styles.xml><?xml version="1.0" encoding="utf-8"?>
@@ -1859,6 +3688,50 @@
       <w:szCs w:val="32"/>
     </w:rPr>
   </w:style>
+  <w:style w:type="paragraph" w:styleId="Heading2">
+    <w:name w:val="heading 2"/>
+    <w:basedOn w:val="Normal"/>
+    <w:next w:val="Normal"/>
+    <w:link w:val="Heading2Char"/>
+    <w:uiPriority w:val="9"/>
+    <w:unhideWhenUsed/>
+    <w:qFormat/>
+    <w:rsid w:val="0054412F"/>
+    <w:pPr>
+      <w:keepNext/>
+      <w:keepLines/>
+      <w:spacing w:before="40" w:after="0"/>
+      <w:outlineLvl w:val="1"/>
+    </w:pPr>
+    <w:rPr>
+      <w:rFonts w:asciiTheme="majorHAnsi" w:eastAsiaTheme="majorEastAsia" w:hAnsiTheme="majorHAnsi" w:cstheme="majorBidi"/>
+      <w:color w:val="2F5496" w:themeColor="accent1" w:themeShade="BF"/>
+      <w:sz w:val="26"/>
+      <w:szCs w:val="26"/>
+    </w:rPr>
+  </w:style>
+  <w:style w:type="paragraph" w:styleId="Heading3">
+    <w:name w:val="heading 3"/>
+    <w:basedOn w:val="Normal"/>
+    <w:next w:val="Normal"/>
+    <w:link w:val="Heading3Char"/>
+    <w:uiPriority w:val="9"/>
+    <w:unhideWhenUsed/>
+    <w:qFormat/>
+    <w:rsid w:val="003422C2"/>
+    <w:pPr>
+      <w:keepNext/>
+      <w:keepLines/>
+      <w:spacing w:before="40" w:after="0"/>
+      <w:outlineLvl w:val="2"/>
+    </w:pPr>
+    <w:rPr>
+      <w:rFonts w:asciiTheme="majorHAnsi" w:eastAsiaTheme="majorEastAsia" w:hAnsiTheme="majorHAnsi" w:cstheme="majorBidi"/>
+      <w:color w:val="1F3763" w:themeColor="accent1" w:themeShade="7F"/>
+      <w:sz w:val="24"/>
+      <w:szCs w:val="24"/>
+    </w:rPr>
+  </w:style>
   <w:style w:type="character" w:default="1" w:styleId="DefaultParagraphFont">
     <w:name w:val="Default Paragraph Font"/>
     <w:uiPriority w:val="1"/>
@@ -1961,6 +3834,70 @@
       <w:color w:val="0563C1" w:themeColor="hyperlink"/>
       <w:u w:val="single"/>
     </w:rPr>
+  </w:style>
+  <w:style w:type="character" w:customStyle="1" w:styleId="Heading2Char">
+    <w:name w:val="Heading 2 Char"/>
+    <w:basedOn w:val="DefaultParagraphFont"/>
+    <w:link w:val="Heading2"/>
+    <w:uiPriority w:val="9"/>
+    <w:rsid w:val="0054412F"/>
+    <w:rPr>
+      <w:rFonts w:asciiTheme="majorHAnsi" w:eastAsiaTheme="majorEastAsia" w:hAnsiTheme="majorHAnsi" w:cstheme="majorBidi"/>
+      <w:color w:val="2F5496" w:themeColor="accent1" w:themeShade="BF"/>
+      <w:sz w:val="26"/>
+      <w:szCs w:val="26"/>
+    </w:rPr>
+  </w:style>
+  <w:style w:type="paragraph" w:styleId="ListParagraph">
+    <w:name w:val="List Paragraph"/>
+    <w:basedOn w:val="Normal"/>
+    <w:uiPriority w:val="34"/>
+    <w:qFormat/>
+    <w:rsid w:val="0054412F"/>
+    <w:pPr>
+      <w:spacing w:line="256" w:lineRule="auto"/>
+      <w:ind w:left="720"/>
+      <w:contextualSpacing/>
+    </w:pPr>
+  </w:style>
+  <w:style w:type="paragraph" w:styleId="TOC2">
+    <w:name w:val="toc 2"/>
+    <w:basedOn w:val="Normal"/>
+    <w:next w:val="Normal"/>
+    <w:autoRedefine/>
+    <w:uiPriority w:val="39"/>
+    <w:unhideWhenUsed/>
+    <w:rsid w:val="003422C2"/>
+    <w:pPr>
+      <w:spacing w:after="100"/>
+      <w:ind w:left="220"/>
+    </w:pPr>
+  </w:style>
+  <w:style w:type="character" w:customStyle="1" w:styleId="Heading3Char">
+    <w:name w:val="Heading 3 Char"/>
+    <w:basedOn w:val="DefaultParagraphFont"/>
+    <w:link w:val="Heading3"/>
+    <w:uiPriority w:val="9"/>
+    <w:rsid w:val="003422C2"/>
+    <w:rPr>
+      <w:rFonts w:asciiTheme="majorHAnsi" w:eastAsiaTheme="majorEastAsia" w:hAnsiTheme="majorHAnsi" w:cstheme="majorBidi"/>
+      <w:color w:val="1F3763" w:themeColor="accent1" w:themeShade="7F"/>
+      <w:sz w:val="24"/>
+      <w:szCs w:val="24"/>
+    </w:rPr>
+  </w:style>
+  <w:style w:type="paragraph" w:styleId="TOC3">
+    <w:name w:val="toc 3"/>
+    <w:basedOn w:val="Normal"/>
+    <w:next w:val="Normal"/>
+    <w:autoRedefine/>
+    <w:uiPriority w:val="39"/>
+    <w:unhideWhenUsed/>
+    <w:rsid w:val="003422C2"/>
+    <w:pPr>
+      <w:spacing w:after="100"/>
+      <w:ind w:left="440"/>
+    </w:pPr>
   </w:style>
 </w:styles>
 </file>

</xml_diff>